<commit_message>
NCNDA is Non-Compete & Non-Disclosure: rename and add a non-compete clause
Co-Authored-By: Claude Opus 5.5 <noreply@anthropic.com>
</commit_message>
<xml_diff>
--- a/public/retail-os/docs/DevShop-Retail-OS-NCNDA.docx
+++ b/public/retail-os/docs/DevShop-Retail-OS-NCNDA.docx
@@ -30,7 +30,7 @@
           <w:sz w:val="40"/>
           <w:szCs w:val="40"/>
         </w:rPr>
-        <w:t xml:space="preserve">Non-Circumvention &amp; Non-Disclosure Agreement</w:t>
+        <w:t xml:space="preserve">Non-Compete &amp; Non-Disclosure Agreement</w:t>
       </w:r>
     </w:p>
     <w:p>
@@ -60,7 +60,7 @@
           <w:sz w:val="21"/>
           <w:szCs w:val="21"/>
         </w:rPr>
-        <w:t xml:space="preserve">This Non-Circumvention &amp; Non-Disclosure Agreement (“Agreement”) is entered into on </w:t>
+        <w:t xml:space="preserve">This Non-Compete &amp; Non-Disclosure Agreement (“Agreement”) is entered into on </w:t>
       </w:r>
       <w:r>
         <w:rPr>
@@ -309,7 +309,7 @@
           <w:sz w:val="24"/>
           <w:szCs w:val="24"/>
         </w:rPr>
-        <w:t xml:space="preserve">3. Non-Circumvention</w:t>
+        <w:t xml:space="preserve">3. Non-Compete</w:t>
       </w:r>
     </w:p>
     <w:p>
@@ -326,7 +326,7 @@
           <w:sz w:val="21"/>
           <w:szCs w:val="21"/>
         </w:rPr>
-        <w:t xml:space="preserve">Each Party agrees that it shall not, directly or indirectly, bypass, circumvent, or attempt to circumvent the other Party in order to deal directly — for the Purpose or any substantially similar arrangement — with any individual, company, vendor, platform, investor, or other contact introduced by, or made known through, the other Party in connection with this Agreement, without that Party's prior written consent.</w:t>
+        <w:t xml:space="preserve">Neither Party shall use the other Party's Confidential Information to build, launch, operate, or assist any product, service, or business that competes with the other Party's business.</w:t>
       </w:r>
     </w:p>
     <w:p>
@@ -343,7 +343,41 @@
           <w:sz w:val="21"/>
           <w:szCs w:val="21"/>
         </w:rPr>
-        <w:t xml:space="preserve">This obligation survives for a period of twenty-four (24) months from the date of this Agreement, regardless of whether the Parties proceed to a definitive commercial agreement.</w:t>
+        <w:t xml:space="preserve">In particular, the Brand shall not, itself or through any third party, replicate or commission a copy of the DevShop Retail OS platform, its commercial model, or the Pay with a Post™ checkout methodology disclosed to it; and DevShop shall not use the Brand's product formulations, suppliers, pricing, or customer information to launch or support a competing brand.</w:t>
+      </w:r>
+    </w:p>
+    <w:p>
+      <w:pPr>
+        <w:pStyle w:val="ListParagraph"/>
+        <w:numPr>
+          <w:ilvl w:val="0"/>
+          <w:numId w:val="2"/>
+        </w:numPr>
+        <w:spacing w:after="110"/>
+      </w:pPr>
+      <w:r>
+        <w:rPr>
+          <w:sz w:val="21"/>
+          <w:szCs w:val="21"/>
+        </w:rPr>
+        <w:t xml:space="preserve">Neither Party shall, directly or indirectly, bypass the other to deal with any supplier, vendor, platform, investor, or other contact introduced by or made known through the other Party in connection with this Agreement, without that Party's prior written consent.</w:t>
+      </w:r>
+    </w:p>
+    <w:p>
+      <w:pPr>
+        <w:pStyle w:val="ListParagraph"/>
+        <w:numPr>
+          <w:ilvl w:val="0"/>
+          <w:numId w:val="2"/>
+        </w:numPr>
+        <w:spacing w:after="110"/>
+      </w:pPr>
+      <w:r>
+        <w:rPr>
+          <w:sz w:val="21"/>
+          <w:szCs w:val="21"/>
+        </w:rPr>
+        <w:t xml:space="preserve">These obligations apply during discussions and for twenty-four (24) months from the date of this Agreement, regardless of whether the Parties proceed to a definitive commercial agreement.</w:t>
       </w:r>
     </w:p>
     <w:p>

</xml_diff>

<commit_message>
NCNDA v2: the non-compete binds the brand only; DevShop may work with any brand
- Online NCNDA (v2-2026-09): section 4 non-compete applies to the Brand (no replicating
  Retail OS, its model or Pay with a Post; no poaching DevShop's staff or partners);
  new section 5 says nothing restricts DevShop from working with other brands, including
  in the same category; DevShop's only duty is confidentiality.
- Word template updated the same way; signing page, request email and terms page copy
  no longer say the agreement "binds me the same way".
- Test guards the carve-out. Rule added to CLAUDE.md.

Co-Authored-By: Claude Opus 5.5 <noreply@anthropic.com>
</commit_message>
<xml_diff>
--- a/public/retail-os/docs/DevShop-Retail-OS-NCNDA.docx
+++ b/public/retail-os/docs/DevShop-Retail-OS-NCNDA.docx
@@ -326,7 +326,7 @@
           <w:sz w:val="21"/>
           <w:szCs w:val="21"/>
         </w:rPr>
-        <w:t xml:space="preserve">Neither Party shall use the other Party's Confidential Information to build, launch, operate, or assist any product, service, or business that competes with the other Party's business.</w:t>
+        <w:t xml:space="preserve">The Brand shall not use DevShop's Confidential Information to build, launch, operate, or assist any product, service, or business that competes with DevShop, and shall not, itself or through any third party, replicate or commission a copy of the DevShop Retail OS platform, its commercial model, or the Pay with a Post™ checkout methodology disclosed to it.</w:t>
       </w:r>
     </w:p>
     <w:p>
@@ -343,7 +343,7 @@
           <w:sz w:val="21"/>
           <w:szCs w:val="21"/>
         </w:rPr>
-        <w:t xml:space="preserve">In particular, the Brand shall not, itself or through any third party, replicate or commission a copy of the DevShop Retail OS platform, its commercial model, or the Pay with a Post™ checkout methodology disclosed to it; and DevShop shall not use the Brand's product formulations, suppliers, pricing, or customer information to launch or support a competing brand.</w:t>
+        <w:t xml:space="preserve">This Clause 3 applies to the Brand only. Nothing in this Agreement restricts DevShop from building, operating, investing in, or providing services to any other brand or business, including brands that sell in the same product category as the Brand or compete with it. DevShop's only obligation to the Brand is the confidentiality in Clause 2: DevShop will not disclose the Brand's Confidential Information, or use it for anyone else.</w:t>
       </w:r>
     </w:p>
     <w:p>

</xml_diff>

<commit_message>
NCNDA template: non-circumvention binds the counterparty only; DevShop contact is founder@viratmohan.com with address
Co-Authored-By: Claude Opus 5.5 <noreply@anthropic.com>
</commit_message>
<xml_diff>
--- a/public/retail-os/docs/DevShop-Retail-OS-NCNDA.docx
+++ b/public/retail-os/docs/DevShop-Retail-OS-NCNDA.docx
@@ -108,14 +108,14 @@
           <w:sz w:val="21"/>
           <w:szCs w:val="21"/>
         </w:rPr>
-        <w:t xml:space="preserve"> ("DevShop"), with communications address </w:t>
+        <w:t xml:space="preserve"> ("DevShop"), of Villa 111, Laburnum, Sushant Lok Phase 1, Gurugram, Haryana 122001, India, email </w:t>
       </w:r>
       <w:r>
         <w:rPr>
           <w:i/>
           <w:iCs/>
         </w:rPr>
-        <w:t xml:space="preserve">viratmohan@gmail.com</w:t>
+        <w:t xml:space="preserve">founder@viratmohan.com</w:t>
       </w:r>
       <w:r>
         <w:rPr>
@@ -360,7 +360,7 @@
           <w:sz w:val="21"/>
           <w:szCs w:val="21"/>
         </w:rPr>
-        <w:t xml:space="preserve">Neither Party shall, directly or indirectly, bypass the other to deal with any supplier, vendor, platform, investor, or other contact introduced by or made known through the other Party in connection with this Agreement, without that Party's prior written consent.</w:t>
+        <w:t xml:space="preserve">The Brand shall not, directly or indirectly, bypass DevShop to deal with any supplier, vendor, platform, partner, staff member or other contact introduced by DevShop in connection with this Agreement, without DevShop's prior written consent. This obligation does not bind DevShop, which remains free to deal with any supplier, vendor, platform or other party, including for other brands.</w:t>
       </w:r>
     </w:p>
     <w:p>

</xml_diff>